<commit_message>
fix(payroll): stop payslip labels wrapping onto multiple lines
Labels like 'REGULAR HOL', 'DO/REG. HOL.', and 'OTH. EARNINGS N-TAX' were
wrapping across 2-3 lines in the generated payslip instead of sitting on
one line like the real reference payslip. Two causes: the Overtime
Breakdown table's label column was too narrow for its longest labels, and
python-docx's per-cell width alone doesn't force a fixed column layout --
Word/LibreOffice can still auto-size a column to fit wrapped content
unless the table's <w:tblLayout> is explicitly set to 'fixed' and the
<w:tblGrid> column widths are written alongside the per-cell widths.

Widened the Overtime Breakdown label column, added a noWrap flag to
every label cell so text always stays on one line even under a tight
column (matching the real payslip, which never wraps a label regardless
of length), and fixed set_col_widths() to write both the tblGrid and
per-cell widths with a fixed table layout everywhere it's used.
</commit_message>
<xml_diff>
--- a/templates/payroll/Payslip_template.docx
+++ b/templates/payroll/Payslip_template.docx
@@ -24,10 +24,11 @@
         <w:tblW w:type="auto" w:w="0"/>
         <w:tblLayout w:type="fixed"/>
         <w:tblLook w:firstColumn="1" w:firstRow="1" w:lastColumn="0" w:lastRow="0" w:noHBand="0" w:noVBand="1" w:val="04A0"/>
+        <w:tblLayout w:type="fixed"/>
       </w:tblPr>
       <w:tblGrid>
-        <w:gridCol w:w="3816"/>
-        <w:gridCol w:w="3816"/>
+        <w:gridCol w:w="3840480"/>
+        <w:gridCol w:w="1097280"/>
       </w:tblGrid>
       <w:tr>
         <w:tc>
@@ -104,10 +105,11 @@
         <w:tblW w:type="auto" w:w="0"/>
         <w:tblLayout w:type="fixed"/>
         <w:tblLook w:firstColumn="1" w:firstRow="1" w:lastColumn="0" w:lastRow="0" w:noHBand="0" w:noVBand="1" w:val="04A0"/>
+        <w:tblLayout w:type="fixed"/>
       </w:tblPr>
       <w:tblGrid>
-        <w:gridCol w:w="3816"/>
-        <w:gridCol w:w="3816"/>
+        <w:gridCol w:w="914400"/>
+        <w:gridCol w:w="4023360"/>
       </w:tblGrid>
       <w:tr>
         <w:tc>
@@ -167,10 +169,11 @@
         <w:tblW w:type="auto" w:w="0"/>
         <w:tblLayout w:type="fixed"/>
         <w:tblLook w:firstColumn="1" w:firstRow="1" w:lastColumn="0" w:lastRow="0" w:noHBand="0" w:noVBand="1" w:val="04A0"/>
+        <w:tblLayout w:type="fixed"/>
       </w:tblPr>
       <w:tblGrid>
-        <w:gridCol w:w="3816"/>
-        <w:gridCol w:w="3816"/>
+        <w:gridCol w:w="1188720"/>
+        <w:gridCol w:w="3749039"/>
       </w:tblGrid>
       <w:tr>
         <w:tc>
@@ -268,11 +271,12 @@
         <w:tblW w:type="auto" w:w="0"/>
         <w:tblLayout w:type="fixed"/>
         <w:tblLook w:firstColumn="1" w:firstRow="1" w:lastColumn="0" w:lastRow="0" w:noHBand="0" w:noVBand="1" w:val="04A0"/>
+        <w:tblLayout w:type="fixed"/>
       </w:tblPr>
       <w:tblGrid>
-        <w:gridCol w:w="2544"/>
-        <w:gridCol w:w="2544"/>
-        <w:gridCol w:w="2544"/>
+        <w:gridCol w:w="2377440"/>
+        <w:gridCol w:w="1280160"/>
+        <w:gridCol w:w="1280160"/>
       </w:tblGrid>
       <w:tr>
         <w:tc>
@@ -342,6 +346,7 @@
         <w:tc>
           <w:tcPr>
             <w:tcW w:type="dxa" w:w="3744"/>
+            <w:noWrap/>
           </w:tcPr>
           <w:p>
             <w:pPr>
@@ -406,6 +411,7 @@
         <w:tc>
           <w:tcPr>
             <w:tcW w:type="dxa" w:w="3744"/>
+            <w:noWrap/>
           </w:tcPr>
           <w:p>
             <w:pPr>
@@ -470,6 +476,7 @@
         <w:tc>
           <w:tcPr>
             <w:tcW w:type="dxa" w:w="3744"/>
+            <w:noWrap/>
           </w:tcPr>
           <w:p>
             <w:pPr>
@@ -533,6 +540,7 @@
         <w:tc>
           <w:tcPr>
             <w:tcW w:type="dxa" w:w="3744"/>
+            <w:noWrap/>
           </w:tcPr>
           <w:p>
             <w:pPr>
@@ -596,6 +604,7 @@
         <w:tc>
           <w:tcPr>
             <w:tcW w:type="dxa" w:w="3744"/>
+            <w:noWrap/>
           </w:tcPr>
           <w:p>
             <w:pPr>
@@ -659,6 +668,7 @@
         <w:tc>
           <w:tcPr>
             <w:tcW w:type="dxa" w:w="3744"/>
+            <w:noWrap/>
           </w:tcPr>
           <w:p>
             <w:pPr>
@@ -722,6 +732,7 @@
         <w:tc>
           <w:tcPr>
             <w:tcW w:type="dxa" w:w="3744"/>
+            <w:noWrap/>
           </w:tcPr>
           <w:p>
             <w:pPr>
@@ -786,6 +797,7 @@
         <w:tc>
           <w:tcPr>
             <w:tcW w:type="dxa" w:w="3744"/>
+            <w:noWrap/>
           </w:tcPr>
           <w:p>
             <w:pPr>
@@ -850,6 +862,7 @@
         <w:tc>
           <w:tcPr>
             <w:tcW w:type="dxa" w:w="3744"/>
+            <w:noWrap/>
           </w:tcPr>
           <w:p>
             <w:pPr>
@@ -921,9 +934,10 @@
         <w:tblW w:type="auto" w:w="0"/>
         <w:tblLayout w:type="fixed"/>
         <w:tblLook w:firstColumn="1" w:firstRow="1" w:lastColumn="0" w:lastRow="0" w:noHBand="0" w:noVBand="1" w:val="04A0"/>
+        <w:tblLayout w:type="fixed"/>
       </w:tblPr>
       <w:tblGrid>
-        <w:gridCol w:w="7632"/>
+        <w:gridCol w:w="4937760"/>
       </w:tblGrid>
       <w:tr>
         <w:tc>
@@ -956,19 +970,21 @@
         <w:tblW w:type="auto" w:w="0"/>
         <w:tblLayout w:type="fixed"/>
         <w:tblLook w:firstColumn="1" w:firstRow="1" w:lastColumn="0" w:lastRow="0" w:noHBand="0" w:noVBand="1" w:val="04A0"/>
+        <w:tblLayout w:type="fixed"/>
       </w:tblPr>
       <w:tblGrid>
-        <w:gridCol w:w="1272"/>
-        <w:gridCol w:w="1272"/>
-        <w:gridCol w:w="1272"/>
-        <w:gridCol w:w="1272"/>
-        <w:gridCol w:w="1272"/>
-        <w:gridCol w:w="1272"/>
+        <w:gridCol w:w="1417320"/>
+        <w:gridCol w:w="704088"/>
+        <w:gridCol w:w="704088"/>
+        <w:gridCol w:w="704088"/>
+        <w:gridCol w:w="704088"/>
+        <w:gridCol w:w="704088"/>
       </w:tblGrid>
       <w:tr>
         <w:tc>
           <w:tcPr>
-            <w:tcW w:type="dxa" w:w="2592"/>
+            <w:tcW w:type="dxa" w:w="2232"/>
+            <w:noWrap/>
           </w:tcPr>
           <w:p>
             <w:pPr>
@@ -980,7 +996,7 @@
                 <w:rFonts w:ascii="Arial" w:hAnsi="Arial"/>
                 <w:b/>
                 <w:i w:val="0"/>
-                <w:sz w:val="15"/>
+                <w:sz w:val="14"/>
               </w:rPr>
               <w:t>OVERTIME</w:t>
             </w:r>
@@ -988,7 +1004,8 @@
         </w:tc>
         <w:tc>
           <w:tcPr>
-            <w:tcW w:type="dxa" w:w="1037"/>
+            <w:tcW w:type="dxa" w:w="1109"/>
+            <w:noWrap/>
           </w:tcPr>
           <w:p>
             <w:pPr>
@@ -1001,7 +1018,7 @@
                 <w:rFonts w:ascii="Arial" w:hAnsi="Arial"/>
                 <w:b/>
                 <w:i w:val="0"/>
-                <w:sz w:val="15"/>
+                <w:sz w:val="14"/>
               </w:rPr>
               <w:t>OT</w:t>
             </w:r>
@@ -1009,7 +1026,8 @@
         </w:tc>
         <w:tc>
           <w:tcPr>
-            <w:tcW w:type="dxa" w:w="1037"/>
+            <w:tcW w:type="dxa" w:w="1109"/>
+            <w:noWrap/>
           </w:tcPr>
           <w:p>
             <w:pPr>
@@ -1022,7 +1040,7 @@
                 <w:rFonts w:ascii="Arial" w:hAnsi="Arial"/>
                 <w:b/>
                 <w:i w:val="0"/>
-                <w:sz w:val="15"/>
+                <w:sz w:val="14"/>
               </w:rPr>
               <w:t>OT &gt; 8</w:t>
             </w:r>
@@ -1030,7 +1048,8 @@
         </w:tc>
         <w:tc>
           <w:tcPr>
-            <w:tcW w:type="dxa" w:w="1037"/>
+            <w:tcW w:type="dxa" w:w="1109"/>
+            <w:noWrap/>
           </w:tcPr>
           <w:p>
             <w:pPr>
@@ -1043,7 +1062,7 @@
                 <w:rFonts w:ascii="Arial" w:hAnsi="Arial"/>
                 <w:b/>
                 <w:i w:val="0"/>
-                <w:sz w:val="15"/>
+                <w:sz w:val="14"/>
               </w:rPr>
               <w:t>ND</w:t>
             </w:r>
@@ -1051,7 +1070,8 @@
         </w:tc>
         <w:tc>
           <w:tcPr>
-            <w:tcW w:type="dxa" w:w="1037"/>
+            <w:tcW w:type="dxa" w:w="1109"/>
+            <w:noWrap/>
           </w:tcPr>
           <w:p>
             <w:pPr>
@@ -1064,7 +1084,7 @@
                 <w:rFonts w:ascii="Arial" w:hAnsi="Arial"/>
                 <w:b/>
                 <w:i w:val="0"/>
-                <w:sz w:val="15"/>
+                <w:sz w:val="14"/>
               </w:rPr>
               <w:t>ND&gt;8</w:t>
             </w:r>
@@ -1072,7 +1092,8 @@
         </w:tc>
         <w:tc>
           <w:tcPr>
-            <w:tcW w:type="dxa" w:w="1037"/>
+            <w:tcW w:type="dxa" w:w="1109"/>
+            <w:noWrap/>
           </w:tcPr>
           <w:p>
             <w:pPr>
@@ -1085,7 +1106,7 @@
                 <w:rFonts w:ascii="Arial" w:hAnsi="Arial"/>
                 <w:b/>
                 <w:i w:val="0"/>
-                <w:sz w:val="15"/>
+                <w:sz w:val="14"/>
               </w:rPr>
               <w:t>TOTAL</w:t>
             </w:r>
@@ -1095,7 +1116,8 @@
       <w:tr>
         <w:tc>
           <w:tcPr>
-            <w:tcW w:type="dxa" w:w="2592"/>
+            <w:tcW w:type="dxa" w:w="2232"/>
+            <w:noWrap/>
           </w:tcPr>
           <w:p>
             <w:pPr>
@@ -1107,7 +1129,7 @@
                 <w:rFonts w:ascii="Arial" w:hAnsi="Arial"/>
                 <w:b w:val="0"/>
                 <w:i w:val="0"/>
-                <w:sz w:val="15"/>
+                <w:sz w:val="14"/>
               </w:rPr>
               <w:t>REGULAR OT</w:t>
             </w:r>
@@ -1115,7 +1137,7 @@
         </w:tc>
         <w:tc>
           <w:tcPr>
-            <w:tcW w:type="dxa" w:w="1037"/>
+            <w:tcW w:type="dxa" w:w="1109"/>
           </w:tcPr>
           <w:p>
             <w:pPr>
@@ -1136,7 +1158,7 @@
         </w:tc>
         <w:tc>
           <w:tcPr>
-            <w:tcW w:type="dxa" w:w="1037"/>
+            <w:tcW w:type="dxa" w:w="1109"/>
           </w:tcPr>
           <w:p>
             <w:pPr>
@@ -1157,7 +1179,7 @@
         </w:tc>
         <w:tc>
           <w:tcPr>
-            <w:tcW w:type="dxa" w:w="1037"/>
+            <w:tcW w:type="dxa" w:w="1109"/>
           </w:tcPr>
           <w:p>
             <w:pPr>
@@ -1178,7 +1200,7 @@
         </w:tc>
         <w:tc>
           <w:tcPr>
-            <w:tcW w:type="dxa" w:w="1037"/>
+            <w:tcW w:type="dxa" w:w="1109"/>
           </w:tcPr>
           <w:p>
             <w:pPr>
@@ -1199,7 +1221,7 @@
         </w:tc>
         <w:tc>
           <w:tcPr>
-            <w:tcW w:type="dxa" w:w="1037"/>
+            <w:tcW w:type="dxa" w:w="1109"/>
           </w:tcPr>
           <w:p>
             <w:pPr>
@@ -1222,7 +1244,8 @@
       <w:tr>
         <w:tc>
           <w:tcPr>
-            <w:tcW w:type="dxa" w:w="2592"/>
+            <w:tcW w:type="dxa" w:w="2232"/>
+            <w:noWrap/>
           </w:tcPr>
           <w:p>
             <w:pPr>
@@ -1234,7 +1257,7 @@
                 <w:rFonts w:ascii="Arial" w:hAnsi="Arial"/>
                 <w:b w:val="0"/>
                 <w:i w:val="0"/>
-                <w:sz w:val="15"/>
+                <w:sz w:val="14"/>
               </w:rPr>
               <w:t>REGULAR HOL</w:t>
             </w:r>
@@ -1242,7 +1265,7 @@
         </w:tc>
         <w:tc>
           <w:tcPr>
-            <w:tcW w:type="dxa" w:w="1037"/>
+            <w:tcW w:type="dxa" w:w="1109"/>
           </w:tcPr>
           <w:p>
             <w:pPr>
@@ -1263,7 +1286,7 @@
         </w:tc>
         <w:tc>
           <w:tcPr>
-            <w:tcW w:type="dxa" w:w="1037"/>
+            <w:tcW w:type="dxa" w:w="1109"/>
           </w:tcPr>
           <w:p>
             <w:pPr>
@@ -1284,7 +1307,7 @@
         </w:tc>
         <w:tc>
           <w:tcPr>
-            <w:tcW w:type="dxa" w:w="1037"/>
+            <w:tcW w:type="dxa" w:w="1109"/>
           </w:tcPr>
           <w:p>
             <w:pPr>
@@ -1305,7 +1328,7 @@
         </w:tc>
         <w:tc>
           <w:tcPr>
-            <w:tcW w:type="dxa" w:w="1037"/>
+            <w:tcW w:type="dxa" w:w="1109"/>
           </w:tcPr>
           <w:p>
             <w:pPr>
@@ -1326,7 +1349,7 @@
         </w:tc>
         <w:tc>
           <w:tcPr>
-            <w:tcW w:type="dxa" w:w="1037"/>
+            <w:tcW w:type="dxa" w:w="1109"/>
           </w:tcPr>
           <w:p>
             <w:pPr>
@@ -1349,7 +1372,8 @@
       <w:tr>
         <w:tc>
           <w:tcPr>
-            <w:tcW w:type="dxa" w:w="2592"/>
+            <w:tcW w:type="dxa" w:w="2232"/>
+            <w:noWrap/>
           </w:tcPr>
           <w:p>
             <w:pPr>
@@ -1361,7 +1385,7 @@
                 <w:rFonts w:ascii="Arial" w:hAnsi="Arial"/>
                 <w:b w:val="0"/>
                 <w:i w:val="0"/>
-                <w:sz w:val="15"/>
+                <w:sz w:val="14"/>
               </w:rPr>
               <w:t>SPECIAL HOL</w:t>
             </w:r>
@@ -1369,7 +1393,7 @@
         </w:tc>
         <w:tc>
           <w:tcPr>
-            <w:tcW w:type="dxa" w:w="1037"/>
+            <w:tcW w:type="dxa" w:w="1109"/>
           </w:tcPr>
           <w:p>
             <w:pPr>
@@ -1390,7 +1414,7 @@
         </w:tc>
         <w:tc>
           <w:tcPr>
-            <w:tcW w:type="dxa" w:w="1037"/>
+            <w:tcW w:type="dxa" w:w="1109"/>
           </w:tcPr>
           <w:p>
             <w:pPr>
@@ -1411,7 +1435,7 @@
         </w:tc>
         <w:tc>
           <w:tcPr>
-            <w:tcW w:type="dxa" w:w="1037"/>
+            <w:tcW w:type="dxa" w:w="1109"/>
           </w:tcPr>
           <w:p>
             <w:pPr>
@@ -1432,7 +1456,7 @@
         </w:tc>
         <w:tc>
           <w:tcPr>
-            <w:tcW w:type="dxa" w:w="1037"/>
+            <w:tcW w:type="dxa" w:w="1109"/>
           </w:tcPr>
           <w:p>
             <w:pPr>
@@ -1453,7 +1477,7 @@
         </w:tc>
         <w:tc>
           <w:tcPr>
-            <w:tcW w:type="dxa" w:w="1037"/>
+            <w:tcW w:type="dxa" w:w="1109"/>
           </w:tcPr>
           <w:p>
             <w:pPr>
@@ -1476,7 +1500,8 @@
       <w:tr>
         <w:tc>
           <w:tcPr>
-            <w:tcW w:type="dxa" w:w="2592"/>
+            <w:tcW w:type="dxa" w:w="2232"/>
+            <w:noWrap/>
           </w:tcPr>
           <w:p>
             <w:pPr>
@@ -1488,7 +1513,7 @@
                 <w:rFonts w:ascii="Arial" w:hAnsi="Arial"/>
                 <w:b w:val="0"/>
                 <w:i w:val="0"/>
-                <w:sz w:val="15"/>
+                <w:sz w:val="14"/>
               </w:rPr>
               <w:t>DAY OFF</w:t>
             </w:r>
@@ -1496,7 +1521,7 @@
         </w:tc>
         <w:tc>
           <w:tcPr>
-            <w:tcW w:type="dxa" w:w="1037"/>
+            <w:tcW w:type="dxa" w:w="1109"/>
           </w:tcPr>
           <w:p>
             <w:pPr>
@@ -1517,7 +1542,7 @@
         </w:tc>
         <w:tc>
           <w:tcPr>
-            <w:tcW w:type="dxa" w:w="1037"/>
+            <w:tcW w:type="dxa" w:w="1109"/>
           </w:tcPr>
           <w:p>
             <w:pPr>
@@ -1538,7 +1563,7 @@
         </w:tc>
         <w:tc>
           <w:tcPr>
-            <w:tcW w:type="dxa" w:w="1037"/>
+            <w:tcW w:type="dxa" w:w="1109"/>
           </w:tcPr>
           <w:p>
             <w:pPr>
@@ -1559,7 +1584,7 @@
         </w:tc>
         <w:tc>
           <w:tcPr>
-            <w:tcW w:type="dxa" w:w="1037"/>
+            <w:tcW w:type="dxa" w:w="1109"/>
           </w:tcPr>
           <w:p>
             <w:pPr>
@@ -1580,7 +1605,7 @@
         </w:tc>
         <w:tc>
           <w:tcPr>
-            <w:tcW w:type="dxa" w:w="1037"/>
+            <w:tcW w:type="dxa" w:w="1109"/>
           </w:tcPr>
           <w:p>
             <w:pPr>
@@ -1603,7 +1628,8 @@
       <w:tr>
         <w:tc>
           <w:tcPr>
-            <w:tcW w:type="dxa" w:w="2592"/>
+            <w:tcW w:type="dxa" w:w="2232"/>
+            <w:noWrap/>
           </w:tcPr>
           <w:p>
             <w:pPr>
@@ -1615,7 +1641,7 @@
                 <w:rFonts w:ascii="Arial" w:hAnsi="Arial"/>
                 <w:b w:val="0"/>
                 <w:i w:val="0"/>
-                <w:sz w:val="15"/>
+                <w:sz w:val="14"/>
               </w:rPr>
               <w:t>DO/REG. HOL.</w:t>
             </w:r>
@@ -1623,7 +1649,7 @@
         </w:tc>
         <w:tc>
           <w:tcPr>
-            <w:tcW w:type="dxa" w:w="1037"/>
+            <w:tcW w:type="dxa" w:w="1109"/>
           </w:tcPr>
           <w:p>
             <w:pPr>
@@ -1644,7 +1670,7 @@
         </w:tc>
         <w:tc>
           <w:tcPr>
-            <w:tcW w:type="dxa" w:w="1037"/>
+            <w:tcW w:type="dxa" w:w="1109"/>
           </w:tcPr>
           <w:p>
             <w:pPr>
@@ -1665,7 +1691,7 @@
         </w:tc>
         <w:tc>
           <w:tcPr>
-            <w:tcW w:type="dxa" w:w="1037"/>
+            <w:tcW w:type="dxa" w:w="1109"/>
           </w:tcPr>
           <w:p>
             <w:pPr>
@@ -1686,7 +1712,7 @@
         </w:tc>
         <w:tc>
           <w:tcPr>
-            <w:tcW w:type="dxa" w:w="1037"/>
+            <w:tcW w:type="dxa" w:w="1109"/>
           </w:tcPr>
           <w:p>
             <w:pPr>
@@ -1707,7 +1733,7 @@
         </w:tc>
         <w:tc>
           <w:tcPr>
-            <w:tcW w:type="dxa" w:w="1037"/>
+            <w:tcW w:type="dxa" w:w="1109"/>
           </w:tcPr>
           <w:p>
             <w:pPr>
@@ -1730,7 +1756,8 @@
       <w:tr>
         <w:tc>
           <w:tcPr>
-            <w:tcW w:type="dxa" w:w="2592"/>
+            <w:tcW w:type="dxa" w:w="2232"/>
+            <w:noWrap/>
           </w:tcPr>
           <w:p>
             <w:pPr>
@@ -1742,7 +1769,7 @@
                 <w:rFonts w:ascii="Arial" w:hAnsi="Arial"/>
                 <w:b w:val="0"/>
                 <w:i w:val="0"/>
-                <w:sz w:val="15"/>
+                <w:sz w:val="14"/>
               </w:rPr>
               <w:t>DO/SPC. HOL.</w:t>
             </w:r>
@@ -1750,7 +1777,7 @@
         </w:tc>
         <w:tc>
           <w:tcPr>
-            <w:tcW w:type="dxa" w:w="1037"/>
+            <w:tcW w:type="dxa" w:w="1109"/>
           </w:tcPr>
           <w:p>
             <w:pPr>
@@ -1771,7 +1798,7 @@
         </w:tc>
         <w:tc>
           <w:tcPr>
-            <w:tcW w:type="dxa" w:w="1037"/>
+            <w:tcW w:type="dxa" w:w="1109"/>
           </w:tcPr>
           <w:p>
             <w:pPr>
@@ -1792,7 +1819,7 @@
         </w:tc>
         <w:tc>
           <w:tcPr>
-            <w:tcW w:type="dxa" w:w="1037"/>
+            <w:tcW w:type="dxa" w:w="1109"/>
           </w:tcPr>
           <w:p>
             <w:pPr>
@@ -1813,7 +1840,7 @@
         </w:tc>
         <w:tc>
           <w:tcPr>
-            <w:tcW w:type="dxa" w:w="1037"/>
+            <w:tcW w:type="dxa" w:w="1109"/>
           </w:tcPr>
           <w:p>
             <w:pPr>
@@ -1834,7 +1861,7 @@
         </w:tc>
         <w:tc>
           <w:tcPr>
-            <w:tcW w:type="dxa" w:w="1037"/>
+            <w:tcW w:type="dxa" w:w="1109"/>
           </w:tcPr>
           <w:p>
             <w:pPr>
@@ -1857,7 +1884,8 @@
       <w:tr>
         <w:tc>
           <w:tcPr>
-            <w:tcW w:type="dxa" w:w="2592"/>
+            <w:tcW w:type="dxa" w:w="2232"/>
+            <w:noWrap/>
           </w:tcPr>
           <w:p>
             <w:pPr>
@@ -1869,7 +1897,7 @@
                 <w:rFonts w:ascii="Arial" w:hAnsi="Arial"/>
                 <w:b/>
                 <w:i w:val="0"/>
-                <w:sz w:val="15"/>
+                <w:sz w:val="14"/>
               </w:rPr>
               <w:t>TOTAL OT</w:t>
             </w:r>
@@ -1877,7 +1905,7 @@
         </w:tc>
         <w:tc>
           <w:tcPr>
-            <w:tcW w:type="dxa" w:w="1037"/>
+            <w:tcW w:type="dxa" w:w="1109"/>
           </w:tcPr>
           <w:p>
             <w:pPr>
@@ -1898,7 +1926,7 @@
         </w:tc>
         <w:tc>
           <w:tcPr>
-            <w:tcW w:type="dxa" w:w="1037"/>
+            <w:tcW w:type="dxa" w:w="1109"/>
           </w:tcPr>
           <w:p>
             <w:pPr>
@@ -1919,7 +1947,7 @@
         </w:tc>
         <w:tc>
           <w:tcPr>
-            <w:tcW w:type="dxa" w:w="1037"/>
+            <w:tcW w:type="dxa" w:w="1109"/>
           </w:tcPr>
           <w:p>
             <w:pPr>
@@ -1940,7 +1968,7 @@
         </w:tc>
         <w:tc>
           <w:tcPr>
-            <w:tcW w:type="dxa" w:w="1037"/>
+            <w:tcW w:type="dxa" w:w="1109"/>
           </w:tcPr>
           <w:p>
             <w:pPr>
@@ -1961,7 +1989,7 @@
         </w:tc>
         <w:tc>
           <w:tcPr>
-            <w:tcW w:type="dxa" w:w="1037"/>
+            <w:tcW w:type="dxa" w:w="1109"/>
           </w:tcPr>
           <w:p>
             <w:pPr>
@@ -1992,10 +2020,11 @@
         <w:tblW w:type="auto" w:w="0"/>
         <w:tblLayout w:type="fixed"/>
         <w:tblLook w:firstColumn="1" w:firstRow="1" w:lastColumn="0" w:lastRow="0" w:noHBand="0" w:noVBand="1" w:val="04A0"/>
+        <w:tblLayout w:type="fixed"/>
       </w:tblPr>
       <w:tblGrid>
-        <w:gridCol w:w="3816"/>
-        <w:gridCol w:w="3816"/>
+        <w:gridCol w:w="3566160"/>
+        <w:gridCol w:w="1371600"/>
       </w:tblGrid>
       <w:tr>
         <w:tc>
@@ -2047,17 +2076,18 @@
         <w:tblW w:type="auto" w:w="0"/>
         <w:tblLayout w:type="fixed"/>
         <w:tblLook w:firstColumn="1" w:firstRow="1" w:lastColumn="0" w:lastRow="0" w:noHBand="0" w:noVBand="1" w:val="04A0"/>
+        <w:tblLayout w:type="fixed"/>
       </w:tblPr>
       <w:tblGrid>
-        <w:gridCol w:w="1908"/>
-        <w:gridCol w:w="1908"/>
-        <w:gridCol w:w="1908"/>
-        <w:gridCol w:w="1908"/>
+        <w:gridCol w:w="1554480"/>
+        <w:gridCol w:w="914400"/>
+        <w:gridCol w:w="1188720"/>
+        <w:gridCol w:w="1188720"/>
       </w:tblGrid>
       <w:tr>
         <w:tc>
           <w:tcPr>
-            <w:tcW w:type="dxa" w:w="2880"/>
+            <w:tcW w:type="dxa" w:w="2448"/>
           </w:tcPr>
           <w:p>
             <w:pPr>
@@ -2077,7 +2107,7 @@
         </w:tc>
         <w:tc>
           <w:tcPr>
-            <w:tcW w:type="dxa" w:w="1584"/>
+            <w:tcW w:type="dxa" w:w="1440"/>
           </w:tcPr>
           <w:p>
             <w:pPr>
@@ -2098,7 +2128,7 @@
         </w:tc>
         <w:tc>
           <w:tcPr>
-            <w:tcW w:type="dxa" w:w="1656"/>
+            <w:tcW w:type="dxa" w:w="1872"/>
           </w:tcPr>
           <w:p>
             <w:pPr>
@@ -2119,7 +2149,7 @@
         </w:tc>
         <w:tc>
           <w:tcPr>
-            <w:tcW w:type="dxa" w:w="1656"/>
+            <w:tcW w:type="dxa" w:w="1872"/>
           </w:tcPr>
           <w:p>
             <w:pPr>
@@ -2142,7 +2172,8 @@
       <w:tr>
         <w:tc>
           <w:tcPr>
-            <w:tcW w:type="dxa" w:w="2880"/>
+            <w:tcW w:type="dxa" w:w="2448"/>
+            <w:noWrap/>
           </w:tcPr>
           <w:p>
             <w:pPr>
@@ -2162,7 +2193,7 @@
         </w:tc>
         <w:tc>
           <w:tcPr>
-            <w:tcW w:type="dxa" w:w="1584"/>
+            <w:tcW w:type="dxa" w:w="1440"/>
           </w:tcPr>
           <w:p>
             <w:pPr>
@@ -2183,7 +2214,7 @@
         </w:tc>
         <w:tc>
           <w:tcPr>
-            <w:tcW w:type="dxa" w:w="1656"/>
+            <w:tcW w:type="dxa" w:w="1872"/>
           </w:tcPr>
           <w:p>
             <w:pPr>
@@ -2204,7 +2235,7 @@
         </w:tc>
         <w:tc>
           <w:tcPr>
-            <w:tcW w:type="dxa" w:w="1656"/>
+            <w:tcW w:type="dxa" w:w="1872"/>
           </w:tcPr>
           <w:p>
             <w:pPr>
@@ -2227,7 +2258,8 @@
       <w:tr>
         <w:tc>
           <w:tcPr>
-            <w:tcW w:type="dxa" w:w="2880"/>
+            <w:tcW w:type="dxa" w:w="2448"/>
+            <w:noWrap/>
           </w:tcPr>
           <w:p>
             <w:pPr>
@@ -2247,7 +2279,7 @@
         </w:tc>
         <w:tc>
           <w:tcPr>
-            <w:tcW w:type="dxa" w:w="1584"/>
+            <w:tcW w:type="dxa" w:w="1440"/>
           </w:tcPr>
           <w:p>
             <w:pPr>
@@ -2268,7 +2300,7 @@
         </w:tc>
         <w:tc>
           <w:tcPr>
-            <w:tcW w:type="dxa" w:w="1656"/>
+            <w:tcW w:type="dxa" w:w="1872"/>
           </w:tcPr>
           <w:p>
             <w:pPr>
@@ -2289,7 +2321,7 @@
         </w:tc>
         <w:tc>
           <w:tcPr>
-            <w:tcW w:type="dxa" w:w="1656"/>
+            <w:tcW w:type="dxa" w:w="1872"/>
           </w:tcPr>
           <w:p>
             <w:pPr>
@@ -2312,7 +2344,8 @@
       <w:tr>
         <w:tc>
           <w:tcPr>
-            <w:tcW w:type="dxa" w:w="2880"/>
+            <w:tcW w:type="dxa" w:w="2448"/>
+            <w:noWrap/>
           </w:tcPr>
           <w:p>
             <w:pPr>
@@ -2332,7 +2365,7 @@
         </w:tc>
         <w:tc>
           <w:tcPr>
-            <w:tcW w:type="dxa" w:w="1584"/>
+            <w:tcW w:type="dxa" w:w="1440"/>
           </w:tcPr>
           <w:p>
             <w:pPr>
@@ -2353,7 +2386,7 @@
         </w:tc>
         <w:tc>
           <w:tcPr>
-            <w:tcW w:type="dxa" w:w="1656"/>
+            <w:tcW w:type="dxa" w:w="1872"/>
           </w:tcPr>
           <w:p>
             <w:pPr>
@@ -2374,7 +2407,7 @@
         </w:tc>
         <w:tc>
           <w:tcPr>
-            <w:tcW w:type="dxa" w:w="1656"/>
+            <w:tcW w:type="dxa" w:w="1872"/>
           </w:tcPr>
           <w:p>
             <w:pPr>
@@ -2397,7 +2430,8 @@
       <w:tr>
         <w:tc>
           <w:tcPr>
-            <w:tcW w:type="dxa" w:w="2880"/>
+            <w:tcW w:type="dxa" w:w="2448"/>
+            <w:noWrap/>
           </w:tcPr>
           <w:p>
             <w:pPr>
@@ -2417,7 +2451,7 @@
         </w:tc>
         <w:tc>
           <w:tcPr>
-            <w:tcW w:type="dxa" w:w="1584"/>
+            <w:tcW w:type="dxa" w:w="1440"/>
           </w:tcPr>
           <w:p>
             <w:pPr>
@@ -2438,7 +2472,7 @@
         </w:tc>
         <w:tc>
           <w:tcPr>
-            <w:tcW w:type="dxa" w:w="1656"/>
+            <w:tcW w:type="dxa" w:w="1872"/>
           </w:tcPr>
           <w:p>
             <w:pPr>
@@ -2459,7 +2493,7 @@
         </w:tc>
         <w:tc>
           <w:tcPr>
-            <w:tcW w:type="dxa" w:w="1656"/>
+            <w:tcW w:type="dxa" w:w="1872"/>
           </w:tcPr>
           <w:p>
             <w:pPr>
@@ -2482,7 +2516,8 @@
       <w:tr>
         <w:tc>
           <w:tcPr>
-            <w:tcW w:type="dxa" w:w="2880"/>
+            <w:tcW w:type="dxa" w:w="2448"/>
+            <w:noWrap/>
           </w:tcPr>
           <w:p>
             <w:pPr>
@@ -2502,7 +2537,7 @@
         </w:tc>
         <w:tc>
           <w:tcPr>
-            <w:tcW w:type="dxa" w:w="1584"/>
+            <w:tcW w:type="dxa" w:w="1440"/>
           </w:tcPr>
           <w:p>
             <w:pPr>
@@ -2523,7 +2558,7 @@
         </w:tc>
         <w:tc>
           <w:tcPr>
-            <w:tcW w:type="dxa" w:w="1656"/>
+            <w:tcW w:type="dxa" w:w="1872"/>
           </w:tcPr>
           <w:p>
             <w:pPr>
@@ -2544,7 +2579,7 @@
         </w:tc>
         <w:tc>
           <w:tcPr>
-            <w:tcW w:type="dxa" w:w="1656"/>
+            <w:tcW w:type="dxa" w:w="1872"/>
           </w:tcPr>
           <w:p>
             <w:pPr>
@@ -2567,7 +2602,8 @@
       <w:tr>
         <w:tc>
           <w:tcPr>
-            <w:tcW w:type="dxa" w:w="2880"/>
+            <w:tcW w:type="dxa" w:w="2448"/>
+            <w:noWrap/>
           </w:tcPr>
           <w:p>
             <w:pPr>
@@ -2587,7 +2623,7 @@
         </w:tc>
         <w:tc>
           <w:tcPr>
-            <w:tcW w:type="dxa" w:w="1584"/>
+            <w:tcW w:type="dxa" w:w="1440"/>
           </w:tcPr>
           <w:p>
             <w:pPr>
@@ -2608,7 +2644,7 @@
         </w:tc>
         <w:tc>
           <w:tcPr>
-            <w:tcW w:type="dxa" w:w="1656"/>
+            <w:tcW w:type="dxa" w:w="1872"/>
           </w:tcPr>
           <w:p>
             <w:pPr>
@@ -2629,7 +2665,7 @@
         </w:tc>
         <w:tc>
           <w:tcPr>
-            <w:tcW w:type="dxa" w:w="1656"/>
+            <w:tcW w:type="dxa" w:w="1872"/>
           </w:tcPr>
           <w:p>
             <w:pPr>
@@ -2652,7 +2688,8 @@
       <w:tr>
         <w:tc>
           <w:tcPr>
-            <w:tcW w:type="dxa" w:w="2880"/>
+            <w:tcW w:type="dxa" w:w="2448"/>
+            <w:noWrap/>
           </w:tcPr>
           <w:p>
             <w:pPr>
@@ -2672,7 +2709,7 @@
         </w:tc>
         <w:tc>
           <w:tcPr>
-            <w:tcW w:type="dxa" w:w="1584"/>
+            <w:tcW w:type="dxa" w:w="1440"/>
           </w:tcPr>
           <w:p>
             <w:pPr>
@@ -2693,7 +2730,7 @@
         </w:tc>
         <w:tc>
           <w:tcPr>
-            <w:tcW w:type="dxa" w:w="1656"/>
+            <w:tcW w:type="dxa" w:w="1872"/>
           </w:tcPr>
           <w:p>
             <w:pPr>
@@ -2714,7 +2751,7 @@
         </w:tc>
         <w:tc>
           <w:tcPr>
-            <w:tcW w:type="dxa" w:w="1656"/>
+            <w:tcW w:type="dxa" w:w="1872"/>
           </w:tcPr>
           <w:p>
             <w:pPr>
@@ -2737,7 +2774,8 @@
       <w:tr>
         <w:tc>
           <w:tcPr>
-            <w:tcW w:type="dxa" w:w="2880"/>
+            <w:tcW w:type="dxa" w:w="2448"/>
+            <w:noWrap/>
           </w:tcPr>
           <w:p>
             <w:pPr>
@@ -2757,7 +2795,7 @@
         </w:tc>
         <w:tc>
           <w:tcPr>
-            <w:tcW w:type="dxa" w:w="1584"/>
+            <w:tcW w:type="dxa" w:w="1440"/>
           </w:tcPr>
           <w:p>
             <w:pPr>
@@ -2778,7 +2816,7 @@
         </w:tc>
         <w:tc>
           <w:tcPr>
-            <w:tcW w:type="dxa" w:w="1656"/>
+            <w:tcW w:type="dxa" w:w="1872"/>
           </w:tcPr>
           <w:p>
             <w:pPr>
@@ -2799,7 +2837,7 @@
         </w:tc>
         <w:tc>
           <w:tcPr>
-            <w:tcW w:type="dxa" w:w="1656"/>
+            <w:tcW w:type="dxa" w:w="1872"/>
           </w:tcPr>
           <w:p>
             <w:pPr>
@@ -2830,9 +2868,10 @@
         <w:tblW w:type="auto" w:w="0"/>
         <w:tblLayout w:type="fixed"/>
         <w:tblLook w:firstColumn="1" w:firstRow="1" w:lastColumn="0" w:lastRow="0" w:noHBand="0" w:noVBand="1" w:val="04A0"/>
+        <w:tblLayout w:type="fixed"/>
       </w:tblPr>
       <w:tblGrid>
-        <w:gridCol w:w="7632"/>
+        <w:gridCol w:w="4937760"/>
       </w:tblGrid>
       <w:tr>
         <w:tc>
@@ -2865,11 +2904,12 @@
         <w:tblW w:type="auto" w:w="0"/>
         <w:tblLayout w:type="fixed"/>
         <w:tblLook w:firstColumn="1" w:firstRow="1" w:lastColumn="0" w:lastRow="0" w:noHBand="0" w:noVBand="1" w:val="04A0"/>
+        <w:tblLayout w:type="fixed"/>
       </w:tblPr>
       <w:tblGrid>
-        <w:gridCol w:w="2544"/>
-        <w:gridCol w:w="2544"/>
-        <w:gridCol w:w="2544"/>
+        <w:gridCol w:w="3383280"/>
+        <w:gridCol w:w="457200"/>
+        <w:gridCol w:w="1097280"/>
       </w:tblGrid>
       <w:tr>
         <w:tc>
@@ -3008,9 +3048,10 @@
         <w:tblW w:type="auto" w:w="0"/>
         <w:tblLayout w:type="fixed"/>
         <w:tblLook w:firstColumn="1" w:firstRow="1" w:lastColumn="0" w:lastRow="0" w:noHBand="0" w:noVBand="1" w:val="04A0"/>
+        <w:tblLayout w:type="fixed"/>
       </w:tblPr>
       <w:tblGrid>
-        <w:gridCol w:w="7632"/>
+        <w:gridCol w:w="4937760"/>
       </w:tblGrid>
       <w:tr>
         <w:tc>
@@ -3043,11 +3084,12 @@
         <w:tblW w:type="auto" w:w="0"/>
         <w:tblLayout w:type="fixed"/>
         <w:tblLook w:firstColumn="1" w:firstRow="1" w:lastColumn="0" w:lastRow="0" w:noHBand="0" w:noVBand="1" w:val="04A0"/>
+        <w:tblLayout w:type="fixed"/>
       </w:tblPr>
       <w:tblGrid>
-        <w:gridCol w:w="2544"/>
-        <w:gridCol w:w="2544"/>
-        <w:gridCol w:w="2544"/>
+        <w:gridCol w:w="3383280"/>
+        <w:gridCol w:w="457200"/>
+        <w:gridCol w:w="1097280"/>
       </w:tblGrid>
       <w:tr>
         <w:tc>
@@ -3186,10 +3228,11 @@
         <w:tblW w:type="auto" w:w="0"/>
         <w:tblLayout w:type="fixed"/>
         <w:tblLook w:firstColumn="1" w:firstRow="1" w:lastColumn="0" w:lastRow="0" w:noHBand="0" w:noVBand="1" w:val="04A0"/>
+        <w:tblLayout w:type="fixed"/>
       </w:tblPr>
       <w:tblGrid>
-        <w:gridCol w:w="3816"/>
-        <w:gridCol w:w="3816"/>
+        <w:gridCol w:w="3566160"/>
+        <w:gridCol w:w="1371600"/>
       </w:tblGrid>
       <w:tr>
         <w:tc>
@@ -3329,10 +3372,11 @@
         <w:tblW w:type="auto" w:w="0"/>
         <w:tblLayout w:type="fixed"/>
         <w:tblLook w:firstColumn="1" w:firstRow="1" w:lastColumn="0" w:lastRow="0" w:noHBand="0" w:noVBand="1" w:val="04A0"/>
+        <w:tblLayout w:type="fixed"/>
       </w:tblPr>
       <w:tblGrid>
-        <w:gridCol w:w="3816"/>
-        <w:gridCol w:w="3816"/>
+        <w:gridCol w:w="2743200"/>
+        <w:gridCol w:w="2194560"/>
       </w:tblGrid>
       <w:tr>
         <w:tc>

</xml_diff>